<commit_message>
Docs: default display build is TFT_ST7789
The design doc still said TFT_ST7735 was the default; it has been
ST7789 since 137e520.

Co-Authored-By: Claude Opus 5 <noreply@anthropic.com>
</commit_message>
<xml_diff>
--- a/docs/cw_decoder_design.docx
+++ b/docs/cw_decoder_design.docx
@@ -988,7 +988,7 @@
         <w:rPr>
           <w:rStyle w:val="VerbatimChar"/>
         </w:rPr>
-        <w:t xml:space="preserve">TFT_ST7735</w:t>
+        <w:t xml:space="preserve">TFT_ST7789</w:t>
       </w:r>
       <w:r>
         <w:t xml:space="preserve">。</w:t>
@@ -1015,7 +1015,7 @@
         <w:rPr>
           <w:rStyle w:val="VerbatimChar"/>
         </w:rPr>
-        <w:t xml:space="preserve">TFT_ST7789</w:t>
+        <w:t xml:space="preserve">TFT_ST7735</w:t>
       </w:r>
       <w:r>
         <w:t xml:space="preserve"> </w:t>

</xml_diff>